<commit_message>
Expose core review materials at repository root
</commit_message>
<xml_diff>
--- a/docs/操作系统创新小分队_基于深度强化学习的云—边—端异构计算资源管理调度方法_项目说明书.docx
+++ b/docs/操作系统创新小分队_基于深度强化学习的云—边—端异构计算资源管理调度方法_项目说明书.docx
@@ -20448,67 +20448,67 @@
         <w:rPr>
           <w:rFonts w:hint="eastAsia"/>
         </w:rPr>
-        <w:t>项目在</w:t>
-      </w:r>
-      <w:r>
-        <w:rPr>
-          <w:rFonts w:hint="eastAsia"/>
-        </w:rPr>
-        <w:t xml:space="preserve"> openeuler/openeuler:24.03-lts-sp4 </w:t>
-      </w:r>
-      <w:r>
-        <w:rPr>
-          <w:rFonts w:hint="eastAsia"/>
-        </w:rPr>
-        <w:t>容器中挂载同一代码与</w:t>
-      </w:r>
-      <w:r>
-        <w:rPr>
-          <w:rFonts w:hint="eastAsia"/>
-        </w:rPr>
-        <w:t xml:space="preserve"> checkpoint</w:t>
-      </w:r>
-      <w:r>
-        <w:rPr>
-          <w:rFonts w:hint="eastAsia"/>
-        </w:rPr>
-        <w:t>，完成依赖安装、</w:t>
-      </w:r>
-      <w:r>
-        <w:rPr>
-          <w:rFonts w:hint="eastAsia"/>
-        </w:rPr>
-        <w:t xml:space="preserve">pytest </w:t>
-      </w:r>
-      <w:r>
-        <w:rPr>
-          <w:rFonts w:hint="eastAsia"/>
-        </w:rPr>
-        <w:t>和评测。结构化测试记录为</w:t>
-      </w:r>
-      <w:r>
-        <w:rPr>
-          <w:rFonts w:hint="eastAsia"/>
-        </w:rPr>
-        <w:t xml:space="preserve"> 19 passed, 17 warnings in 5.33s</w:t>
-      </w:r>
-      <w:r>
-        <w:rPr>
-          <w:rFonts w:hint="eastAsia"/>
-        </w:rPr>
-        <w:t>。该证据验证推理和测试流程的跨平台可运行性，不声称不同</w:t>
-      </w:r>
-      <w:r>
-        <w:rPr>
-          <w:rFonts w:hint="eastAsia"/>
-        </w:rPr>
-        <w:t xml:space="preserve"> CPU </w:t>
-      </w:r>
-      <w:r>
-        <w:rPr>
-          <w:rFonts w:hint="eastAsia"/>
-        </w:rPr>
-        <w:t>上的随机采样结果逐位一致。</w:t>
+        <w:t>项目在 openeuler/openeuler:24.03-lts-sp4 容器中挂载同一代码与 checkpoint，完成依赖安装、pytest 和评测。归档 openEuler 日志记录较早测试集为 19 passed, 17 warnings in 5.33s；当前代码新增测试后为 22 passed, 17 warnings，演示视频亦显示 22 passed。两次均无失败，测试数差异来自用例更新。该证据验证推理和测试流程的跨平台可运行性，不声称不同 CPU 上的随机采样结果逐位一致。</w:t>
+      </w:r>
+      <w:r>
+        <w:rPr>
+          <w:rFonts w:hint="eastAsia"/>
+        </w:rPr>
+        <w:t xml:space="preserve"/>
+      </w:r>
+      <w:r>
+        <w:rPr>
+          <w:rFonts w:hint="eastAsia"/>
+        </w:rPr>
+        <w:t/>
+      </w:r>
+      <w:r>
+        <w:rPr>
+          <w:rFonts w:hint="eastAsia"/>
+        </w:rPr>
+        <w:t xml:space="preserve"/>
+      </w:r>
+      <w:r>
+        <w:rPr>
+          <w:rFonts w:hint="eastAsia"/>
+        </w:rPr>
+        <w:t/>
+      </w:r>
+      <w:r>
+        <w:rPr>
+          <w:rFonts w:hint="eastAsia"/>
+        </w:rPr>
+        <w:t xml:space="preserve"/>
+      </w:r>
+      <w:r>
+        <w:rPr>
+          <w:rFonts w:hint="eastAsia"/>
+        </w:rPr>
+        <w:t/>
+      </w:r>
+      <w:r>
+        <w:rPr>
+          <w:rFonts w:hint="eastAsia"/>
+        </w:rPr>
+        <w:t xml:space="preserve"/>
+      </w:r>
+      <w:r>
+        <w:rPr>
+          <w:rFonts w:hint="eastAsia"/>
+        </w:rPr>
+        <w:t/>
+      </w:r>
+      <w:r>
+        <w:rPr>
+          <w:rFonts w:hint="eastAsia"/>
+        </w:rPr>
+        <w:t xml:space="preserve"/>
+      </w:r>
+      <w:r>
+        <w:rPr>
+          <w:rFonts w:hint="eastAsia"/>
+        </w:rPr>
+        <w:t/>
       </w:r>
     </w:p>
     <w:p>

</xml_diff>